<commit_message>
Stop long topic labels blowing out the phone generate form.
Keep insert/sign chips compact and bump the PWA cache so phones pick up the layout fixes.

Co-authored-by: Cursor <cursoragent@cursor.com>
</commit_message>
<xml_diff>
--- a/docs/MOBILE.docx
+++ b/docs/MOBILE.docx
@@ -933,7 +933,27 @@
               <w:t>1 column</w:t>
             </w:r>
             <w:r>
-              <w:t xml:space="preserve"> below ~480–600px (currently stays 2-col at 600px)</w:t>
+              <w:t xml:space="preserve"> below ~480–600px; </w:t>
+            </w:r>
+            <w:r>
+              <w:rPr>
+                <w:rFonts w:ascii="Consolas" w:hAnsi="Consolas"/>
+                <w:sz w:val="20"/>
+              </w:rPr>
+              <w:t>minmax(0, 1fr)</w:t>
+            </w:r>
+            <w:r>
+              <w:t xml:space="preserve"> + select </w:t>
+            </w:r>
+            <w:r>
+              <w:rPr>
+                <w:rFonts w:ascii="Consolas" w:hAnsi="Consolas"/>
+                <w:sz w:val="20"/>
+              </w:rPr>
+              <w:t>min-width: 0</w:t>
+            </w:r>
+            <w:r>
+              <w:t xml:space="preserve"> so long topic labels cannot blow out the card</w:t>
             </w:r>
           </w:p>
         </w:tc>
@@ -1238,7 +1258,7 @@
                 <w:rFonts w:ascii="Consolas" w:hAnsi="Consolas"/>
                 <w:sz w:val="20"/>
               </w:rPr>
-              <w:t>pb-v7</w:t>
+              <w:t>pb-v9</w:t>
             </w:r>
             <w:r>
               <w:t xml:space="preserve"> — </w:t>
@@ -1526,7 +1546,7 @@
               <w:t>number_fields</w:t>
             </w:r>
             <w:r>
-              <w:t xml:space="preserve"> / proof banks: wrap chips; labels above fields; kill horizontal min-width traps</w:t>
+              <w:t xml:space="preserve"> / proof banks: wrap chips; labels above fields; kill horizontal min-width traps. Insert/sign chips stay compact — do not stretch full-width</w:t>
             </w:r>
           </w:p>
         </w:tc>
@@ -1551,9 +1571,6 @@
                 <w:b/>
               </w:rPr>
               <w:t>done</w:t>
-            </w:r>
-            <w:r>
-              <w:t xml:space="preserve"> (labels already above in the partial)</w:t>
             </w:r>
           </w:p>
         </w:tc>

</xml_diff>